<commit_message>
UD 11: el Anexo Spring Boot pasa a unidad final con 4 boletines, cadena de cierres y artefactos regenerados (44 boletines, 155 MD, build 156 paginas); DOCX: carpeta docx/ antigua eliminada y docx_out/ regenerado con UD 11; PDF comprimido con Ghostscript (23,2->12,9 MB) y EPUB/PDF actualizados
</commit_message>
<xml_diff>
--- a/docx_out/INDICE.docx
+++ b/docx_out/INDICE.docx
@@ -533,7 +533,7 @@
           <w:b/>
           <w:bCs/>
         </w:rPr>
-        <w:t xml:space="preserve">Anexo - Spring Boot</w:t>
+        <w:t xml:space="preserve">UD 11 - Spring Boot</w:t>
       </w:r>
       <w:r>
         <w:t xml:space="preserve"> </w:t>
@@ -548,7 +548,22 @@
         <w:rPr>
           <w:rStyle w:val="VerbatimChar"/>
         </w:rPr>
-        <w:t xml:space="preserve">Anexo - Apuntes.docx</w:t>
+        <w:t xml:space="preserve">UD 11 - Apuntes.docx</w:t>
+      </w:r>
+      <w:r>
+        <w:t xml:space="preserve"> </w:t>
+      </w:r>
+      <w:r>
+        <w:t xml:space="preserve">+</w:t>
+      </w:r>
+      <w:r>
+        <w:t xml:space="preserve"> </w:t>
+      </w:r>
+      <w:r>
+        <w:rPr>
+          <w:rStyle w:val="VerbatimChar"/>
+        </w:rPr>
+        <w:t xml:space="preserve">UD 11 - Boletines.docx</w:t>
       </w:r>
     </w:p>
     <w:sectPr>

</xml_diff>